<commit_message>
Paper v5: H5 by question (Amendment 4), boundary components, Figure 3 title fix
- code/amendment4_h5.py: question-level split-half for H5 and 1,000-split distribution
- code/boundary_components.py + docs/boundary_components.csv: variance components at the boundary per fit
- code/v2_amendment2.py: figure title punctuation only, no change to estimates
- docs/forecast_full_REPORT.md: Amendment 4 results appended
- docs/figures: new H5 question-split figure, regenerated v2 figures
- docs/Sun_2026_Where_the_Benchmark_Can_Err.docx/.pdf: preprint v5
</commit_message>
<xml_diff>
--- a/docs/Sun_2026_Where_the_Benchmark_Can_Err.docx
+++ b/docs/Sun_2026_Where_the_Benchmark_Can_Err.docx
@@ -87,7 +87,7 @@
           <w:b w:val="0"/>
           <w:i w:val="0"/>
         </w:rPr>
-        <w:t>In an earlier study of chess, human players deviated from a strictly stronger engine toward sharper positions, and the deviations were not repaid. This study asks whether deviation from a model earns a return in a domain where the model itself can err. I use the one ForecastBench round with individual-level human forecasts (July 2024): 40 superforecasters and 500 public forecasters on 578 resolved targets across 162 questions, matched to 34 language-model variants that saw the same information. The benchmark is the single best model, chosen on questions the humans never forecast. Five hypotheses were locked and pushed to a public repository before any analysis. Superforecasters beat the benchmark on average (+3.4 Brier points ×100) and public forecasters did not (−7.8). The median forecast of each group carried outcome information the best single model did not encompass (coefficients 1.79 and 0.97, both intervals above zero); the public result is the cleaner comparison because superforecasters deliberated in a group stage. A second locked specification then varied the benchmark across all 34 model variants. The information the human median adds does not fall as the model improves within this generation of models, but an exploratory comparison against the median of the other 33 models found that only the superforecasters add information on a scale-free measure; the public median does not add more than another model-like source would. Per-forecaster gain over the benchmark was stable across a split of the round's targets (r = 0.78 superforecasters, 0.64 public). The gain did not rise where the models disagreed with one another against the single best model, and this null held under an alternative disagreement measure and on dataset questions only; against the median of the 34 models it rose, so the moderator result depends on the benchmark. Whether extremizing relative to the model pays depends on the scoring rule: the coefficient is positive under Brier and negative under the log score, and a post-hoc diagnostic locates the disagreement in a tail of confident public errors. The pre-registered extremization-by-disagreement interaction reversed sign between the pilot and the full sample and is not interpreted. Set beside the chess result, the two domains agree that the direction of deviation is not simply profitable and that the gain is not located where the benchmark is least certain. They differ on whether human deviation carries information beyond a single model at all, which is consistent with the fallibility of the benchmark deciding that. Two specifications and five amendments, two of them post-results diagnostics, are disclosed in full.</w:t>
+        <w:t>In an earlier chess study, human deviations from a strictly stronger engine went toward sharper positions and were not repaid. This study asks whether deviation from a model earns a return in a domain where the model can err. I use the one ForecastBench round with individual-level human forecasts (July 2024): 40 superforecasters and 500 public forecasters on 578 resolved targets across 162 questions, matched to 34 language-model variants with the same freeze values and no news. The benchmark is the best single model, selected on questions no human forecast. Five hypotheses were locked before analysis. Superforecasters beat the benchmark on average (+3.4 Brier points ×100); public forecasters did not (−7.8). The median forecast of each group carried outcome information the benchmark did not encompass (coefficients 1.79 and 0.97). The humans could search the web and the model could not, so this is information available to the forecasters and not to the model, and the test does not separate the two. A second locked specification varied the benchmark across the 34 variants. Against the median of the other 33, only the superforecasters added information, on an exploratory scale-free measure. Within the round, per-forecaster gain over the benchmark has only a small stable component: split-half r by question is 0.22 for public forecasters and 0.27, with an interval including zero, for superforecasters. Beside chess, the two domains agree that the direction of deviation is not simply profitable, and differ on whether the human deviation carries anything beyond a single model.</w:t>
       </w:r>
     </w:p>
     <w:p>
@@ -108,7 +108,7 @@
           <w:b w:val="0"/>
           <w:i w:val="0"/>
         </w:rPr>
-        <w:t>Sun (2026) compared human middlegame moves with a chess engine's first choice. The engine was strictly stronger. Human deviations from it had a direction: players chose moves that made the position sharper. The direction did not pay. Sharper deviations lost more, and a counterfactual test found that the opponent's extra error beyond what position difficulty explained did not rise with sharpness. The paper closed by saying that complementarity between a person and a machine needs a domain the machine does not dominate, and left that as a question.</w:t>
+        <w:t>Sun (2026), a preprint on Zenodo, compared human middlegame moves with a chess engine's first choice. The engine was strictly stronger. Human deviations from it had a direction: players chose moves that made the position sharper. The direction did not pay. Sharper deviations lost more, and a counterfactual test found that the opponent's extra error beyond what position difficulty explained did not rise with sharpness. The paper closed by saying that complementarity between a person and a machine needs a domain the machine does not dominate, and left that as a question.</w:t>
       </w:r>
     </w:p>
     <w:p>
@@ -1136,7 +1136,7 @@
           <w:b/>
           <w:sz w:val="20"/>
         </w:rPr>
-        <w:t>Table 2. Core quantities. 33,334 rows, 578 targets, 162 questions, 540 forecasters. Mixed-model coefficients are standardized; intervals are question-clustered or bootstrap as specified in each section.</w:t>
+        <w:t>Table 2. Core quantities. 33,334 rows, 578 targets, 162 questions, 540 forecasters. Predictors in the H3 and H4 mixed models are standardized; outcomes are in raw units, stated per row. Intervals are question-clustered or bootstrap as specified in each section.</w:t>
       </w:r>
     </w:p>
     <w:tbl>
@@ -1241,12 +1241,8 @@
               <w:keepNext/>
               <w:spacing w:after="0" w:before="0"/>
             </w:pPr>
-            <w:r/>
             <w:r>
-              <w:rPr>
-                <w:sz w:val="19"/>
-              </w:rPr>
-              <w:t>mean G_a ×100, superforecasters</w:t>
+              <w:t>mean G_a, superforecasters (Brier points ×100)</w:t>
             </w:r>
           </w:p>
         </w:tc>
@@ -1300,12 +1296,8 @@
               <w:keepNext/>
               <w:spacing w:after="0" w:before="0"/>
             </w:pPr>
-            <w:r/>
             <w:r>
-              <w:rPr>
-                <w:sz w:val="19"/>
-              </w:rPr>
-              <w:t>mean G_a ×100, public</w:t>
+              <w:t>mean G_a, public (Brier points ×100)</w:t>
             </w:r>
           </w:p>
         </w:tc>
@@ -1359,12 +1351,8 @@
               <w:keepNext/>
               <w:spacing w:after="0" w:before="0"/>
             </w:pPr>
-            <w:r/>
             <w:r>
-              <w:rPr>
-                <w:sz w:val="19"/>
-              </w:rPr>
-              <w:t>encompassing coefficient, superforecaster median</w:t>
+              <w:t>encompassing coefficient, superforecaster median (log-odds per unit of logit(p_h) − logit(p_a))</w:t>
             </w:r>
           </w:p>
         </w:tc>
@@ -1418,12 +1406,8 @@
               <w:keepNext/>
               <w:spacing w:after="0" w:before="0"/>
             </w:pPr>
-            <w:r/>
             <w:r>
-              <w:rPr>
-                <w:sz w:val="19"/>
-              </w:rPr>
-              <w:t>encompassing coefficient, public median</w:t>
+              <w:t>encompassing coefficient, public median (log-odds per unit)</w:t>
             </w:r>
           </w:p>
         </w:tc>
@@ -1477,12 +1461,8 @@
               <w:keepNext/>
               <w:spacing w:after="0" w:before="0"/>
             </w:pPr>
-            <w:r/>
             <w:r>
-              <w:rPr>
-                <w:sz w:val="19"/>
-              </w:rPr>
-              <w:t>DIS_z on G_a</w:t>
+              <w:t>DIS_z on G_a (raw Brier units per SD of DIS)</w:t>
             </w:r>
           </w:p>
         </w:tc>
@@ -1536,12 +1516,8 @@
               <w:keepNext/>
               <w:spacing w:after="0" w:before="0"/>
             </w:pPr>
-            <w:r/>
             <w:r>
-              <w:rPr>
-                <w:sz w:val="19"/>
-              </w:rPr>
-              <w:t>EXT_a_z on G_a, all rows (Brier)</w:t>
+              <w:t>EXT_a_z on G_a, all rows (raw Brier units per SD of EXT_a; 0.028 = 2.8 points ×100)</w:t>
             </w:r>
           </w:p>
         </w:tc>
@@ -1595,12 +1571,8 @@
               <w:keepNext/>
               <w:spacing w:after="0" w:before="0"/>
             </w:pPr>
-            <w:r/>
             <w:r>
-              <w:rPr>
-                <w:sz w:val="19"/>
-              </w:rPr>
-              <w:t>EXT_a_z on G_a, non-crossing rows (Brier)</w:t>
+              <w:t>EXT_a_z on G_a, non-crossing rows (raw Brier units per SD)</w:t>
             </w:r>
           </w:p>
         </w:tc>
@@ -1654,12 +1626,8 @@
               <w:keepNext/>
               <w:spacing w:after="0" w:before="0"/>
             </w:pPr>
-            <w:r/>
             <w:r>
-              <w:rPr>
-                <w:sz w:val="19"/>
-              </w:rPr>
-              <w:t>EXT_a_z on G_log (log score)</w:t>
+              <w:t>EXT_a_z on G_log (raw log-score units per SD)</w:t>
             </w:r>
           </w:p>
         </w:tc>
@@ -1713,12 +1681,8 @@
               <w:keepNext/>
               <w:spacing w:after="0" w:before="0"/>
             </w:pPr>
-            <w:r/>
             <w:r>
-              <w:rPr>
-                <w:sz w:val="19"/>
-              </w:rPr>
-              <w:t>EXT_a_z × DIS_z, all rows</w:t>
+              <w:t>EXT_a_z × DIS_z on G_a, all rows (raw Brier units per SD × SD)</w:t>
             </w:r>
           </w:p>
         </w:tc>
@@ -1772,12 +1736,8 @@
               <w:keepNext/>
               <w:spacing w:after="0" w:before="0"/>
             </w:pPr>
-            <w:r/>
             <w:r>
-              <w:rPr>
-                <w:sz w:val="19"/>
-              </w:rPr>
-              <w:t>split-half r, superforecasters</w:t>
+              <w:t>split-half r by question, superforecasters (Pearson, n = 39)</w:t>
             </w:r>
           </w:p>
         </w:tc>
@@ -1790,12 +1750,8 @@
               <w:keepNext/>
               <w:spacing w:after="0" w:before="0"/>
             </w:pPr>
-            <w:r/>
             <w:r>
-              <w:rPr>
-                <w:sz w:val="19"/>
-              </w:rPr>
-              <w:t>0.78 [0.61, 0.90]</w:t>
+              <w:t>0.27 [−0.10, 0.52]</w:t>
             </w:r>
           </w:p>
         </w:tc>
@@ -1831,12 +1787,8 @@
               <w:keepNext w:val="0"/>
               <w:spacing w:after="0" w:before="0"/>
             </w:pPr>
-            <w:r/>
             <w:r>
-              <w:rPr>
-                <w:sz w:val="19"/>
-              </w:rPr>
-              <w:t>split-half r, public</w:t>
+              <w:t>split-half r by question, public (Pearson, n = 500)</w:t>
             </w:r>
           </w:p>
         </w:tc>
@@ -1849,12 +1801,8 @@
               <w:keepNext w:val="0"/>
               <w:spacing w:after="0" w:before="0"/>
             </w:pPr>
-            <w:r/>
             <w:r>
-              <w:rPr>
-                <w:sz w:val="19"/>
-              </w:rPr>
-              <w:t>0.64 [0.59, 0.69]</w:t>
+              <w:t>0.22 [0.13, 0.30]</w:t>
             </w:r>
           </w:p>
         </w:tc>
@@ -1919,6 +1867,18 @@
           <w:b w:val="0"/>
           <w:i w:val="0"/>
         </w:rPr>
+        <w:t>The test cannot say where the information came from. Both human groups could search the web at forecast time. The matched model variants had freeze values and no news, and the benchmark's training data end months before the forecast date. A human median that carries outcome information the model lacks may therefore reflect better judgment, access to news the model never saw, or both. This paper refers to it as information available to the forecasters and not to the model, and makes no claim about judgment as such.</w:t>
+      </w:r>
+    </w:p>
+    <w:p>
+      <w:pPr>
+        <w:spacing w:after="120"/>
+      </w:pPr>
+      <w:r>
+        <w:rPr>
+          <w:b w:val="0"/>
+          <w:i w:val="0"/>
+        </w:rPr>
         <w:t>This is the point at which the forecasting domain parts from chess. In chess, the human deviation carried nothing the engine lacked: the opponent's error beyond difficulty did not rise with the deviation's character, and the deviation cost on average. Here a public forecaster who lost to the model on average still contributed, in aggregate, something the model did not have. Losing on average and carrying information are compatible. The public forecasts are noisier than the model's and the noise costs Brier points, but the signal inside them is not already in the model. Section 6 asks the harder question of whether that signal is already in the other models.</w:t>
       </w:r>
     </w:p>
@@ -2009,7 +1969,7 @@
           <w:b w:val="0"/>
           <w:i w:val="0"/>
         </w:rPr>
-        <w:t>Under the log score the coefficient is −0.022 (−0.033 to −0.011). The two intervals do not overlap and neither contains zero. Whether extremizing relative to the model pays therefore depends on the scoring rule, and the claim cannot be stated without that qualifier. Both are proper scoring rules. The Brier score is bounded and treats a confident wrong forecast as costing at most 1. The log score is unbounded below and treats it as costing without limit, subject to the clip. A pattern in which extremization is usually in the right direction and occasionally far wrong will look profitable under one rule and costly under the other.</w:t>
+        <w:t>Under the log score the coefficient is −0.022 (−0.033 to −0.011). The two intervals do not overlap and neither contains zero. Whether extremizing relative to the model pays therefore depends on the scoring rule, and the claim cannot be stated without that qualifier. Both are proper scoring rules. Neither is correct in general. Which one to use depends on what the forecast is for, and in particular on whether one confident error can cost without limit. The Brier score is bounded and treats a confident wrong forecast as costing at most 1. The log score is unbounded below and treats it as costing without limit, subject to the clip. A pattern in which extremization is usually in the right direction and occasionally far wrong will look profitable under one rule and costly under the other.</w:t>
       </w:r>
     </w:p>
     <w:p>
@@ -2054,7 +2014,7 @@
           <w:b w:val="0"/>
           <w:i w:val="0"/>
         </w:rPr>
-        <w:t>For each row I subtract from G_a the mean of G_a across all other forecasters on that target, leaving the forecaster's own row out. This removes the target's difficulty, which would otherwise leak into a forecaster's average through the non-random set of targets they chose to answer. The 578 targets were then split in half by one random assignment (seed 20260906), the same split for every forecaster, and each forecaster's mean demeaned gain was computed in each half.</w:t>
+        <w:t>For each row I subtract from G_a the mean of G_a across all other forecasters on that target, leaving the forecaster's own row out. This removes the target's difficulty, which would otherwise leak into a forecaster's average through the non-random set of targets they chose to answer. The 162 questions were then split in half by one random assignment (seed 20260906), with every target of a question in the same half and the same split for every forecaster, and each forecaster's mean demeaned gain was computed in each half. The split is by question rather than by target because targets of one question at different horizons often share an outcome and the same judgment; a split by target would place that judgment in both halves and inflate the correlation. The specification as locked split by target. The change is Amendment 4, recorded in Section 9, and the target-level result is reported there.</w:t>
       </w:r>
     </w:p>
     <w:p>
@@ -2066,7 +2026,7 @@
           <w:b w:val="0"/>
           <w:i w:val="0"/>
         </w:rPr>
-        <w:t>The correlation across forecasters between the two half-means is 0.78 for superforecasters (bootstrap 95% CI 0.61 to 0.90, 40 forecasters) and 0.64 for public forecasters (0.59 to 0.69, 500 forecasters). Spearman correlations are 0.80 and 0.61. Figure 2 shows the two scatters. Who has a return over the model is a stable attribute of the forecaster within this round.</w:t>
+        <w:t>The correlation across forecasters between the two half-means is 0.27 for superforecasters (bootstrap 95% CI −0.10 to 0.52; 39 forecasters, one excluded for having no target in one half) and 0.22 for public forecasters (0.13 to 0.30, 500 forecasters). Spearman correlations are 0.23 and 0.22. Each half holds 81 questions, so these are reliabilities of a half-length measure; the Spearman-Brown values for the full set are 0.43 and 0.35. Across 1,000 random question-level splits the median r is 0.38 for superforecasters (2.5th to 97.5th percentile −0.45 to 0.78) and 0.23 for public forecasters (0.16 to 0.29). Figure 2 shows the two scatters. For public forecasters a stable per-forecaster component exists and is small. For superforecasters the sample of 39 does not resolve it: the interval includes zero and the estimate moves with the split.</w:t>
       </w:r>
     </w:p>
     <w:p>
@@ -2118,14 +2078,7 @@
           <w:b/>
           <w:sz w:val="20"/>
         </w:rPr>
-        <w:t xml:space="preserve">Figure 2. </w:t>
-      </w:r>
-      <w:r>
-        <w:rPr>
-          <w:i/>
-          <w:sz w:val="20"/>
-        </w:rPr>
-        <w:t>Split-half stability of per-forecaster gain over benchmark (a), after leave-one-out target demeaning. Left: 40 superforecasters. Right: 500 public forecasters. Each point is one forecaster's mean demeaned gain in the two halves of the target set.</w:t>
+        <w:t>Figure 2. Split-half stability of per-forecaster gain over benchmark (a), after leave-one-out target demeaning, with the 162 questions split in half (Amendment 4). Left: 39 superforecasters. Right: 500 public forecasters. Each point is one forecaster's mean demeaned gain in the two halves.</w:t>
       </w:r>
     </w:p>
     <w:p>
@@ -2137,7 +2090,7 @@
           <w:b w:val="0"/>
           <w:i w:val="0"/>
         </w:rPr>
-        <w:t>The forecaster random intercept in the H3 model accounts for 4.1% of the variance of G_a; question and target together account for 28%, and the residual for 68%. A small variance share and a high split-half correlation are consistent. Most of the row-to-row variation in gain is about the target, but the part that is about the forecaster is reliably measured once targets are averaged over.</w:t>
+        <w:t>The forecaster random intercept in the H3 model accounts for 4.1% of the variance of G_a; question and target together account for 28%, and the residual for 68%. A small variance share and a low split-half correlation are consistent. Most of the variation in gain is about the target, and one round of about 80 questions per half does not average that away.</w:t>
       </w:r>
     </w:p>
     <w:p>
@@ -2149,7 +2102,7 @@
           <w:b w:val="0"/>
           <w:i w:val="0"/>
         </w:rPr>
-        <w:t>This is the bridge to the individual-difference line. It says the quantity exists and can be measured. It does not say what it is made of, and it does not say whether it survives across rounds, because there is only one round.</w:t>
+        <w:t>This is what the individual-difference line can take from this round. The quantity can be computed, and a small stable part of it is detectable in a sample of 500. Whether it is a property of the person, and what it is made of, needs more than one round: a test across time, not across a split of one round.</w:t>
       </w:r>
     </w:p>
     <w:p>
@@ -2386,12 +2339,8 @@
               <w:keepNext/>
               <w:spacing w:after="0" w:before="0"/>
             </w:pPr>
-            <w:r/>
             <w:r>
-              <w:rPr>
-                <w:sz w:val="19"/>
-              </w:rPr>
-              <w:t>Yes. Both group medians carry outcome information the model does not encompass (1.79, 0.97).</w:t>
+              <w:t>Yes. Both group medians carry outcome information the model does not encompass (1.79, 0.97). Humans had web access; the model did not.</w:t>
             </w:r>
           </w:p>
         </w:tc>
@@ -2563,12 +2512,8 @@
               <w:keepNext w:val="0"/>
               <w:spacing w:after="0" w:before="0"/>
             </w:pPr>
-            <w:r/>
             <w:r>
-              <w:rPr>
-                <w:sz w:val="19"/>
-              </w:rPr>
-              <w:t>Yes, within the round (r = 0.78, 0.64).</w:t>
+              <w:t>Small for public forecasters (r = 0.22 by question); not resolved for superforecasters (0.27, interval includes zero).</w:t>
             </w:r>
           </w:p>
         </w:tc>
@@ -2612,7 +2557,7 @@
           <w:b w:val="0"/>
           <w:i w:val="0"/>
         </w:rPr>
-        <w:t>The two domains differ on one thing, and the difference is consistent with the benchmark's fallibility being what decides it. In chess the human deviation carried no information the engine lacked. In forecasting it did, relative to the single best model, for both groups, including the group that lost to the model on average. Section 6 narrows that: relative to an ensemble of the other models, only the superforecasters add something on a scale-free measure. The forecasting result that survives is relative to a single model; the chess study had no ensemble counterpart, so the two-case comparison is between single benchmarks. Whether the human has anything to add is consistent with being set by whether the benchmark can err. Where it adds, and in which direction, is not settled by that, and the forecasting results give no simple answer to either. The two domains differ in more than the benchmark's fallibility, so this is a pattern across two cases, not a test of what produces it.</w:t>
+        <w:t>The two domains differ on one thing. In chess the human and the engine saw the same board. In forecasting the humans could look up news the model did not have. So the difference is consistent with the benchmark's fallibility deciding it, and equally with a difference in information access, and this design cannot separate the two. In chess the human deviation carried no information the engine lacked. In forecasting it did, relative to the single best model, for both groups, including the group that lost to the model on average. Section 6 narrows that: relative to an ensemble of the other models, only the superforecasters add something on a scale-free measure. The forecasting result that survives is relative to a single model; the chess study had no ensemble counterpart, so the two-case comparison is between single benchmarks. Whether the human has anything to add is consistent with being set by whether the benchmark can err. Where it adds, and in which direction, is not settled by that, and the forecasting results give no simple answer to either. The two domains differ in more than the benchmark's fallibility, including what information each side had, so this is a pattern across two cases, not a test of what produces it.</w:t>
       </w:r>
     </w:p>
     <w:p>
@@ -3493,7 +3438,7 @@
           <w:b w:val="0"/>
           <w:i w:val="0"/>
         </w:rPr>
-        <w:t>One round. Everything here is from the forecast due date 2024-07-21, the only round with individual-level human forecasts. Nothing can be checked for replication across rounds, forecaster skill cannot be separated from round-specific luck, and the H5 stability is stability across a split of one round's targets, not across time.</w:t>
+        <w:t>One round. Everything here is from the forecast due date 2024-07-21, the only round with individual-level human forecasts. Nothing can be checked for replication across rounds, forecaster skill cannot be separated from round-specific luck, and the H5 stability is stability across a split of one round's questions, not across time.</w:t>
       </w:r>
     </w:p>
     <w:p>
@@ -3529,6 +3474,18 @@
           <w:b w:val="0"/>
           <w:i w:val="0"/>
         </w:rPr>
+        <w:t>Judgment and information are not separated. The humans could search; the models could not. Every result here that says the human adds something the model lacks is about information available to the forecasters, whatever its source. A comparison against news-augmented variants of the same model would separate part of this, and is left for a follow-up.</w:t>
+      </w:r>
+    </w:p>
+    <w:p>
+      <w:pPr>
+        <w:spacing w:after="120"/>
+      </w:pPr>
+      <w:r>
+        <w:rPr>
+          <w:b w:val="0"/>
+          <w:i w:val="0"/>
+        </w:rPr>
         <w:t>Benchmark dependence. The H3 disagreement result changes sign when the single best model is swapped for the median of 34. A result that moves with the benchmark is a result about the benchmark as much as about the forecasters. I chose the single model as primary before seeing any data because it mirrors the chess design, and I report the other because the specification required it.</w:t>
       </w:r>
     </w:p>
@@ -3658,7 +3615,19 @@
           <w:b w:val="0"/>
           <w:i w:val="0"/>
         </w:rPr>
-        <w:t>All mixed models converged. Every fit printed the statsmodels warning that the maximum-likelihood estimate may be on the boundary of the parameter space, which for these crossed-intercept models means at least one variance component is estimated at or near zero. The coefficient estimates and their intervals are reported as fitted. R and lme4 were not installed; the mixed models were fitted in statsmodels 0.14.6. The pilot was refitted after the full run with the final model code to confirm that its numbers were unchanged (1,741 numeric tokens identical).</w:t>
+        <w:t>Amendment 4, after the results and after a review, changed the H5 split from targets to questions, for the reason given in Section 4.5. It was pushed before the new split was computed, with the rule that the paper leads with the question-level estimate whatever its value. The locked target-level split gave r = 0.78 for superforecasters and 0.64 for public forecasters; the question-level split gives 0.27 and 0.22. The difference is the inflation described in Section 4.5, not a change in the data.</w:t>
+      </w:r>
+    </w:p>
+    <w:p>
+      <w:pPr>
+        <w:spacing w:after="120"/>
+      </w:pPr>
+      <w:r>
+        <w:rPr>
+          <w:b w:val="0"/>
+          <w:i w:val="0"/>
+        </w:rPr>
+        <w:t>All mixed models converged. Every fit printed the statsmodels warning that the maximum-likelihood estimate may be on the boundary of the parameter space, For the second review every reported mixed model was refitted (159 fits, each reproducing its published fixed effects) and the variance components read off. Under a rule of a variance below 1e-6 or below 0.1% of the residual variance, no forecaster, question, or target component is at the boundary in any fit; the smallest is a forecaster variance at 0.9% of the residual. The warning does not correspond to a component estimated at zero. The per-fit values are in the repository (docs/boundary_components.csv). The coefficient estimates and their intervals are reported as fitted. R and lme4 were not installed; the mixed models were fitted in statsmodels 0.14.6. The pilot was refitted after the full run with the final model code to confirm that its numbers were unchanged (1,741 numeric tokens identical).</w:t>
       </w:r>
     </w:p>
     <w:p>
@@ -3703,7 +3672,7 @@
           <w:b w:val="0"/>
           <w:i w:val="0"/>
         </w:rPr>
-        <w:t>In a domain where the benchmark can err, human deviation from it carries information the best single model lacks. That was true for the median of superforecasters who beat the model and for the median of a crowd of independent public forecasters who did not. Against an ensemble of the other models, an exploratory comparison found that only the superforecasters add information, and within this generation of models the human's addition does not fall as the model improves. Whether the deviation pays depends on the direction and on how confident errors are priced, and where it pays is not where the models disagree. The return a forecaster earns over the model is a stable property of that forecaster within the round. Beside the chess result, where a strictly stronger benchmark left the human deviation with nothing to add, the pattern across the two cases is consistent with the fallibility of the benchmark deciding whether the human has anything to contribute, while leaving open where and in which direction. The next step in this line is a second round of individual-level data, so that the stability found here can be tested across time rather than across a split of one round.</w:t>
+        <w:t>In a domain where the benchmark can err, human deviation from it carries information that was available to the forecasters and not to the best single model. This design cannot say whether that information came from judgment or from what the forecasters could look up. That was true for the median of superforecasters who beat the model and for the median of a crowd of independent public forecasters who did not. Against an ensemble of the other models, an exploratory comparison found that only the superforecasters add information, and within this generation of models the human's addition does not fall as the model improves. Whether the deviation pays depends on the direction and on how confident errors are priced, and where it pays is not where the models disagree. The return a forecaster earns over the model has a stable component within the round, but a small one, and one round cannot say more about it. Beside the chess result, where a strictly stronger benchmark left the human deviation with nothing to add, the pattern across the two cases is consistent with the fallibility of the benchmark, or the information the human has beyond it, deciding whether the human has anything to contribute, while leaving open where and in which direction. The next step in this line is a second round of individual-level data, so that the per-forecaster return can be tested across time rather than across a split of one round.</w:t>
       </w:r>
     </w:p>
     <w:p>
@@ -3733,6 +3702,27 @@
         <w:keepNext/>
       </w:pPr>
       <w:r>
+        <w:t>Author note</w:t>
+      </w:r>
+    </w:p>
+    <w:p>
+      <w:pPr>
+        <w:spacing w:after="120"/>
+      </w:pPr>
+      <w:r>
+        <w:rPr>
+          <w:b w:val="0"/>
+          <w:i w:val="0"/>
+        </w:rPr>
+        <w:t>The author designed the study, wrote and locked both specifications, verified the results, and wrote the manuscript. The author declares no conflicts of interest and received no funding for this work.</w:t>
+      </w:r>
+    </w:p>
+    <w:p>
+      <w:pPr>
+        <w:pStyle w:val="Heading1"/>
+        <w:keepNext/>
+      </w:pPr>
+      <w:r>
         <w:t>References</w:t>
       </w:r>
     </w:p>
@@ -3778,7 +3768,7 @@
         <w:ind w:left="576" w:hanging="576"/>
       </w:pPr>
       <w:r>
-        <w:t>Sun, A. (2026). Sharper, not safer: The direction of human deviations from engine play. Zenodo. https://doi.org/10.5281/zenodo.22267000</w:t>
+        <w:t>Sun, A. (2026). Sharper, not safer: The direction of human deviations from engine play [Preprint]. Zenodo. https://doi.org/10.5281/zenodo.22267000</w:t>
       </w:r>
     </w:p>
     <w:p>

</xml_diff>

<commit_message>
Preprint v7: locked and 1,000-split H5 rows in Table 2, wording pass, Brier (1950) cited; no numbers changed
</commit_message>
<xml_diff>
--- a/docs/Sun_2026_Where_the_Benchmark_Can_Err.docx
+++ b/docs/Sun_2026_Where_the_Benchmark_Can_Err.docx
@@ -66,7 +66,7 @@
           <w:b w:val="0"/>
           <w:i w:val="0"/>
         </w:rPr>
-        <w:t>September 2026</w:t>
+        <w:t>October 2026</w:t>
       </w:r>
     </w:p>
     <w:p>
@@ -87,7 +87,7 @@
           <w:b w:val="0"/>
           <w:i w:val="0"/>
         </w:rPr>
-        <w:t>In an earlier chess study, human deviations from a strictly stronger engine went toward sharper positions and were not repaid. This study asks whether deviation from a model earns a return in a domain where the model can err. I use the one ForecastBench round with individual-level human forecasts (July 2024): 40 superforecasters and 500 public forecasters on 578 resolved targets across 162 questions, matched to 34 language-model variants with the same freeze values and no news. The benchmark is the best single model, selected on questions no human forecast. Five hypotheses were locked before analysis. Superforecasters beat the benchmark on average (+3.4 Brier points ×100); public forecasters did not (−7.8). The median forecast of each group carried outcome information the benchmark did not encompass (coefficients 1.79 and 0.97). The humans could search the web and the model could not, so this is information available to the forecasters and not to the model, and the test does not separate the two. A second locked specification varied the benchmark across the 34 variants. Against the median of the other 33, only the superforecasters added information, on an exploratory scale-free measure. Within the round, per-forecaster gain over the benchmark has only a small stable component: split-half r by question is 0.22 for public forecasters and 0.27, with an interval including zero, for superforecasters. Beside chess, the two domains agree that the direction of deviation is not simply profitable, and differ on whether the human deviation carries anything beyond a single model.</w:t>
+        <w:t>In an earlier chess study, human deviations from a strictly stronger engine went toward sharper positions and were not repaid. This study asks whether deviation from a model earns a return in a domain where the model can err. I use the one ForecastBench round with individual-level human forecasts (July 2024): 40 superforecasters and 500 public forecasters on 578 resolved targets across 162 questions, matched to 34 language-model variants with the same freeze values and no news. The benchmark is the best single model, selected on questions no human forecast. Five hypotheses were locked before analysis. Superforecasters beat the benchmark on average (+3.4 Brier points ×100); public forecasters did not (−7.8). The median forecast of each group carried outcome information the benchmark did not encompass (coefficients 1.79 and 0.97). The humans could search the web and the model could not, so this is information available to the forecasters and not to the model, and the test does not separate the two. A second locked specification varied the benchmark across the 34 variants. Against the median of the other 33, only the superforecasters added information, on an exploratory scale-free measure. Per-forecaster gain over the benchmark has only a small stable component within one round: split-half r by question is 0.22 for public forecasters and 0.27, with an interval including zero, for superforecasters. Beside chess, the two domains agree that the direction of deviation is not simply profitable, and differ on whether the human deviation carries anything beyond a single model.</w:t>
       </w:r>
     </w:p>
     <w:p>
@@ -294,7 +294,7 @@
           <w:b w:val="0"/>
           <w:i w:val="0"/>
         </w:rPr>
-        <w:t>All probabilities are for the event resolving to 1. Brier scores are (p − o)² in raw units; tables report values ×100 and say so. Table 1 lists the row-level quantities and the chess quantity each one stands in for.</w:t>
+        <w:t>All probabilities are for the event resolving to 1. Brier scores (Brier, 1950) are (p − o)² in raw units; tables report values ×100 and say so. Table 1 lists the row-level quantities and the chess quantity each one stands in for.</w:t>
       </w:r>
     </w:p>
     <w:p>
@@ -306,7 +306,7 @@
           <w:b w:val="0"/>
           <w:i w:val="0"/>
         </w:rPr>
-        <w:t>EXT_a has a blind spot. When p_h and p_a lie on opposite sides of 0.5, a positive EXT_a means the human went the other way, not that the human sharpened the model's view. That happens on 29.2% of rows (9,720 of 33,334). The primary H4 pools those rows because the specification did; a sensitivity on non-crossing rows was added after the pilot and is reported beside it.</w:t>
+        <w:t>EXT_a has one limitation. When p_h and p_a lie on opposite sides of 0.5, a positive EXT_a means the human went the other way, not that the human sharpened the model's view. That happens on 29.2% of rows (9,720 of 33,334). The primary H4 pools those rows because the specification did; a sensitivity on non-crossing rows was added after the pilot and is reported beside it.</w:t>
       </w:r>
     </w:p>
     <w:p>
@@ -1123,7 +1123,7 @@
           <w:b w:val="0"/>
           <w:i w:val="0"/>
         </w:rPr>
-        <w:t>Two things about the superforecaster figure need saying at once. Superforecasters were run as a nine-day tournament with a group stage in which they saw one another's forecasts and rationales and could revise. The models forecast once, alone. And both human groups could browse the open web at forecast time; the matched model variants had no retrieval. A positive gain for superforecasters is therefore a statement about a deliberating, searching group against a single-pass model, not about judgment alone. The public group did not deliberate, which is part of why its gain is negative, and the gap between the groups should not be read as pure skill.</w:t>
+        <w:t>Two facts qualify the superforecaster figure. Superforecasters were run as a nine-day tournament with a group stage in which they saw one another's forecasts and rationales and could revise. The models forecast once, alone. And both human groups could browse the open web at forecast time; the matched model variants had no retrieval. A positive gain for superforecasters is therefore a statement about a deliberating, searching group against a single-pass model, not about judgment alone. The public group did not deliberate, which is part of why its gain is negative, and the gap between the groups should not be read as pure skill.</w:t>
       </w:r>
     </w:p>
     <w:p>
@@ -1136,7 +1136,7 @@
           <w:b/>
           <w:sz w:val="20"/>
         </w:rPr>
-        <w:t>Table 2. Core quantities. 33,334 rows, 578 targets, 162 questions, 540 forecasters. Predictors in the H3 and H4 mixed models are standardized; outcomes are in raw units, stated per row. Intervals are question-clustered or bootstrap as specified in each section.</w:t>
+        <w:t>Table 2. Core quantities. 33,334 rows, 578 targets, 162 questions, 540 forecasters. Predictors in the H3 and H4 mixed models are standardized; outcomes are in raw units, stated per row. Intervals are question-clustered or bootstrap as specified in each section. The two 1,000-split rows give the median and the 2.5th to 97.5th percentiles across splits, not a confidence interval. The two as-locked H5 rows are the pre-registered split by target, superseded by Amendment 4 (Section 9).</w:t>
       </w:r>
     </w:p>
     <w:tbl>
@@ -1144,12 +1144,13 @@
         <w:tblStyle w:val="TableGrid"/>
         <w:tblW w:type="auto" w:w="0"/>
         <w:jc w:val="center"/>
+        <w:tblLayout w:type="fixed"/>
         <w:tblLook w:firstColumn="1" w:firstRow="1" w:lastColumn="0" w:lastRow="0" w:noHBand="0" w:noVBand="1" w:val="04A0"/>
       </w:tblPr>
       <w:tblGrid>
-        <w:gridCol w:w="3120"/>
-        <w:gridCol w:w="3120"/>
-        <w:gridCol w:w="3120"/>
+        <w:gridCol w:w="1800"/>
+        <w:gridCol w:w="5256"/>
+        <w:gridCol w:w="2304"/>
       </w:tblGrid>
       <w:tr>
         <w:trPr>
@@ -1157,11 +1158,11 @@
         </w:trPr>
         <w:tc>
           <w:tcPr>
-            <w:tcW w:type="dxa" w:w="1296"/>
+            <w:tcW w:type="dxa" w:w="1800"/>
           </w:tcPr>
           <w:p>
             <w:pPr>
-              <w:keepNext/>
+              <w:keepNext w:val="0"/>
             </w:pPr>
             <w:r/>
             <w:r>
@@ -1175,11 +1176,11 @@
         </w:tc>
         <w:tc>
           <w:tcPr>
-            <w:tcW w:type="dxa" w:w="4896"/>
+            <w:tcW w:type="dxa" w:w="5256"/>
           </w:tcPr>
           <w:p>
             <w:pPr>
-              <w:keepNext/>
+              <w:keepNext w:val="0"/>
             </w:pPr>
             <w:r/>
             <w:r>
@@ -1193,11 +1194,11 @@
         </w:tc>
         <w:tc>
           <w:tcPr>
-            <w:tcW w:type="dxa" w:w="3168"/>
+            <w:tcW w:type="dxa" w:w="2304"/>
           </w:tcPr>
           <w:p>
             <w:pPr>
-              <w:keepNext/>
+              <w:keepNext w:val="0"/>
             </w:pPr>
             <w:r/>
             <w:r>
@@ -1216,11 +1217,11 @@
         </w:trPr>
         <w:tc>
           <w:tcPr>
-            <w:tcW w:type="dxa" w:w="1296"/>
+            <w:tcW w:type="dxa" w:w="1800"/>
           </w:tcPr>
           <w:p>
             <w:pPr>
-              <w:keepNext/>
+              <w:keepNext w:val="0"/>
               <w:spacing w:after="0" w:before="0"/>
             </w:pPr>
             <w:r/>
@@ -1234,11 +1235,11 @@
         </w:tc>
         <w:tc>
           <w:tcPr>
-            <w:tcW w:type="dxa" w:w="4896"/>
+            <w:tcW w:type="dxa" w:w="5256"/>
           </w:tcPr>
           <w:p>
             <w:pPr>
-              <w:keepNext/>
+              <w:keepNext w:val="0"/>
               <w:spacing w:after="0" w:before="0"/>
             </w:pPr>
             <w:r>
@@ -1248,11 +1249,11 @@
         </w:tc>
         <w:tc>
           <w:tcPr>
-            <w:tcW w:type="dxa" w:w="3168"/>
+            <w:tcW w:type="dxa" w:w="2304"/>
           </w:tcPr>
           <w:p>
             <w:pPr>
-              <w:keepNext/>
+              <w:keepNext w:val="0"/>
               <w:spacing w:after="0" w:before="0"/>
             </w:pPr>
             <w:r/>
@@ -1271,11 +1272,11 @@
         </w:trPr>
         <w:tc>
           <w:tcPr>
-            <w:tcW w:type="dxa" w:w="1296"/>
+            <w:tcW w:type="dxa" w:w="1800"/>
           </w:tcPr>
           <w:p>
             <w:pPr>
-              <w:keepNext/>
+              <w:keepNext w:val="0"/>
               <w:spacing w:after="0" w:before="0"/>
             </w:pPr>
             <w:r/>
@@ -1289,11 +1290,11 @@
         </w:tc>
         <w:tc>
           <w:tcPr>
-            <w:tcW w:type="dxa" w:w="4896"/>
+            <w:tcW w:type="dxa" w:w="5256"/>
           </w:tcPr>
           <w:p>
             <w:pPr>
-              <w:keepNext/>
+              <w:keepNext w:val="0"/>
               <w:spacing w:after="0" w:before="0"/>
             </w:pPr>
             <w:r>
@@ -1303,11 +1304,11 @@
         </w:tc>
         <w:tc>
           <w:tcPr>
-            <w:tcW w:type="dxa" w:w="3168"/>
+            <w:tcW w:type="dxa" w:w="2304"/>
           </w:tcPr>
           <w:p>
             <w:pPr>
-              <w:keepNext/>
+              <w:keepNext w:val="0"/>
               <w:spacing w:after="0" w:before="0"/>
             </w:pPr>
             <w:r/>
@@ -1326,11 +1327,11 @@
         </w:trPr>
         <w:tc>
           <w:tcPr>
-            <w:tcW w:type="dxa" w:w="1296"/>
+            <w:tcW w:type="dxa" w:w="1800"/>
           </w:tcPr>
           <w:p>
             <w:pPr>
-              <w:keepNext/>
+              <w:keepNext w:val="0"/>
               <w:spacing w:after="0" w:before="0"/>
             </w:pPr>
             <w:r/>
@@ -1344,11 +1345,11 @@
         </w:tc>
         <w:tc>
           <w:tcPr>
-            <w:tcW w:type="dxa" w:w="4896"/>
+            <w:tcW w:type="dxa" w:w="5256"/>
           </w:tcPr>
           <w:p>
             <w:pPr>
-              <w:keepNext/>
+              <w:keepNext w:val="0"/>
               <w:spacing w:after="0" w:before="0"/>
             </w:pPr>
             <w:r>
@@ -1358,11 +1359,11 @@
         </w:tc>
         <w:tc>
           <w:tcPr>
-            <w:tcW w:type="dxa" w:w="3168"/>
+            <w:tcW w:type="dxa" w:w="2304"/>
           </w:tcPr>
           <w:p>
             <w:pPr>
-              <w:keepNext/>
+              <w:keepNext w:val="0"/>
               <w:spacing w:after="0" w:before="0"/>
             </w:pPr>
             <w:r/>
@@ -1381,11 +1382,11 @@
         </w:trPr>
         <w:tc>
           <w:tcPr>
-            <w:tcW w:type="dxa" w:w="1296"/>
+            <w:tcW w:type="dxa" w:w="1800"/>
           </w:tcPr>
           <w:p>
             <w:pPr>
-              <w:keepNext/>
+              <w:keepNext w:val="0"/>
               <w:spacing w:after="0" w:before="0"/>
             </w:pPr>
             <w:r/>
@@ -1399,11 +1400,11 @@
         </w:tc>
         <w:tc>
           <w:tcPr>
-            <w:tcW w:type="dxa" w:w="4896"/>
+            <w:tcW w:type="dxa" w:w="5256"/>
           </w:tcPr>
           <w:p>
             <w:pPr>
-              <w:keepNext/>
+              <w:keepNext w:val="0"/>
               <w:spacing w:after="0" w:before="0"/>
             </w:pPr>
             <w:r>
@@ -1413,11 +1414,11 @@
         </w:tc>
         <w:tc>
           <w:tcPr>
-            <w:tcW w:type="dxa" w:w="3168"/>
+            <w:tcW w:type="dxa" w:w="2304"/>
           </w:tcPr>
           <w:p>
             <w:pPr>
-              <w:keepNext/>
+              <w:keepNext w:val="0"/>
               <w:spacing w:after="0" w:before="0"/>
             </w:pPr>
             <w:r/>
@@ -1436,11 +1437,11 @@
         </w:trPr>
         <w:tc>
           <w:tcPr>
-            <w:tcW w:type="dxa" w:w="1296"/>
+            <w:tcW w:type="dxa" w:w="1800"/>
           </w:tcPr>
           <w:p>
             <w:pPr>
-              <w:keepNext/>
+              <w:keepNext w:val="0"/>
               <w:spacing w:after="0" w:before="0"/>
             </w:pPr>
             <w:r/>
@@ -1454,11 +1455,11 @@
         </w:tc>
         <w:tc>
           <w:tcPr>
-            <w:tcW w:type="dxa" w:w="4896"/>
+            <w:tcW w:type="dxa" w:w="5256"/>
           </w:tcPr>
           <w:p>
             <w:pPr>
-              <w:keepNext/>
+              <w:keepNext w:val="0"/>
               <w:spacing w:after="0" w:before="0"/>
             </w:pPr>
             <w:r>
@@ -1468,11 +1469,11 @@
         </w:tc>
         <w:tc>
           <w:tcPr>
-            <w:tcW w:type="dxa" w:w="3168"/>
+            <w:tcW w:type="dxa" w:w="2304"/>
           </w:tcPr>
           <w:p>
             <w:pPr>
-              <w:keepNext/>
+              <w:keepNext w:val="0"/>
               <w:spacing w:after="0" w:before="0"/>
             </w:pPr>
             <w:r/>
@@ -1491,11 +1492,11 @@
         </w:trPr>
         <w:tc>
           <w:tcPr>
-            <w:tcW w:type="dxa" w:w="1296"/>
+            <w:tcW w:type="dxa" w:w="1800"/>
           </w:tcPr>
           <w:p>
             <w:pPr>
-              <w:keepNext/>
+              <w:keepNext w:val="0"/>
               <w:spacing w:after="0" w:before="0"/>
             </w:pPr>
             <w:r/>
@@ -1509,11 +1510,11 @@
         </w:tc>
         <w:tc>
           <w:tcPr>
-            <w:tcW w:type="dxa" w:w="4896"/>
+            <w:tcW w:type="dxa" w:w="5256"/>
           </w:tcPr>
           <w:p>
             <w:pPr>
-              <w:keepNext/>
+              <w:keepNext w:val="0"/>
               <w:spacing w:after="0" w:before="0"/>
             </w:pPr>
             <w:r>
@@ -1523,11 +1524,11 @@
         </w:tc>
         <w:tc>
           <w:tcPr>
-            <w:tcW w:type="dxa" w:w="3168"/>
+            <w:tcW w:type="dxa" w:w="2304"/>
           </w:tcPr>
           <w:p>
             <w:pPr>
-              <w:keepNext/>
+              <w:keepNext w:val="0"/>
               <w:spacing w:after="0" w:before="0"/>
             </w:pPr>
             <w:r/>
@@ -1546,11 +1547,11 @@
         </w:trPr>
         <w:tc>
           <w:tcPr>
-            <w:tcW w:type="dxa" w:w="1296"/>
+            <w:tcW w:type="dxa" w:w="1800"/>
           </w:tcPr>
           <w:p>
             <w:pPr>
-              <w:keepNext/>
+              <w:keepNext w:val="0"/>
               <w:spacing w:after="0" w:before="0"/>
             </w:pPr>
             <w:r/>
@@ -1564,11 +1565,11 @@
         </w:tc>
         <w:tc>
           <w:tcPr>
-            <w:tcW w:type="dxa" w:w="4896"/>
+            <w:tcW w:type="dxa" w:w="5256"/>
           </w:tcPr>
           <w:p>
             <w:pPr>
-              <w:keepNext/>
+              <w:keepNext w:val="0"/>
               <w:spacing w:after="0" w:before="0"/>
             </w:pPr>
             <w:r>
@@ -1578,11 +1579,11 @@
         </w:tc>
         <w:tc>
           <w:tcPr>
-            <w:tcW w:type="dxa" w:w="3168"/>
+            <w:tcW w:type="dxa" w:w="2304"/>
           </w:tcPr>
           <w:p>
             <w:pPr>
-              <w:keepNext/>
+              <w:keepNext w:val="0"/>
               <w:spacing w:after="0" w:before="0"/>
             </w:pPr>
             <w:r/>
@@ -1601,11 +1602,11 @@
         </w:trPr>
         <w:tc>
           <w:tcPr>
-            <w:tcW w:type="dxa" w:w="1296"/>
+            <w:tcW w:type="dxa" w:w="1800"/>
           </w:tcPr>
           <w:p>
             <w:pPr>
-              <w:keepNext/>
+              <w:keepNext w:val="0"/>
               <w:spacing w:after="0" w:before="0"/>
             </w:pPr>
             <w:r/>
@@ -1619,11 +1620,11 @@
         </w:tc>
         <w:tc>
           <w:tcPr>
-            <w:tcW w:type="dxa" w:w="4896"/>
+            <w:tcW w:type="dxa" w:w="5256"/>
           </w:tcPr>
           <w:p>
             <w:pPr>
-              <w:keepNext/>
+              <w:keepNext w:val="0"/>
               <w:spacing w:after="0" w:before="0"/>
             </w:pPr>
             <w:r>
@@ -1633,11 +1634,11 @@
         </w:tc>
         <w:tc>
           <w:tcPr>
-            <w:tcW w:type="dxa" w:w="3168"/>
+            <w:tcW w:type="dxa" w:w="2304"/>
           </w:tcPr>
           <w:p>
             <w:pPr>
-              <w:keepNext/>
+              <w:keepNext w:val="0"/>
               <w:spacing w:after="0" w:before="0"/>
             </w:pPr>
             <w:r/>
@@ -1656,11 +1657,11 @@
         </w:trPr>
         <w:tc>
           <w:tcPr>
-            <w:tcW w:type="dxa" w:w="1296"/>
+            <w:tcW w:type="dxa" w:w="1800"/>
           </w:tcPr>
           <w:p>
             <w:pPr>
-              <w:keepNext/>
+              <w:keepNext w:val="0"/>
               <w:spacing w:after="0" w:before="0"/>
             </w:pPr>
             <w:r/>
@@ -1674,11 +1675,11 @@
         </w:tc>
         <w:tc>
           <w:tcPr>
-            <w:tcW w:type="dxa" w:w="4896"/>
+            <w:tcW w:type="dxa" w:w="5256"/>
           </w:tcPr>
           <w:p>
             <w:pPr>
-              <w:keepNext/>
+              <w:keepNext w:val="0"/>
               <w:spacing w:after="0" w:before="0"/>
             </w:pPr>
             <w:r>
@@ -1688,11 +1689,11 @@
         </w:tc>
         <w:tc>
           <w:tcPr>
-            <w:tcW w:type="dxa" w:w="3168"/>
+            <w:tcW w:type="dxa" w:w="2304"/>
           </w:tcPr>
           <w:p>
             <w:pPr>
-              <w:keepNext/>
+              <w:keepNext w:val="0"/>
               <w:spacing w:after="0" w:before="0"/>
             </w:pPr>
             <w:r/>
@@ -1711,58 +1712,7 @@
         </w:trPr>
         <w:tc>
           <w:tcPr>
-            <w:tcW w:type="dxa" w:w="1296"/>
-          </w:tcPr>
-          <w:p>
-            <w:pPr>
-              <w:keepNext/>
-              <w:spacing w:after="0" w:before="0"/>
-            </w:pPr>
-            <w:r/>
-            <w:r>
-              <w:rPr>
-                <w:sz w:val="19"/>
-              </w:rPr>
-              <w:t>H5</w:t>
-            </w:r>
-          </w:p>
-        </w:tc>
-        <w:tc>
-          <w:tcPr>
-            <w:tcW w:type="dxa" w:w="4896"/>
-          </w:tcPr>
-          <w:p>
-            <w:pPr>
-              <w:keepNext/>
-              <w:spacing w:after="0" w:before="0"/>
-            </w:pPr>
-            <w:r>
-              <w:t>split-half r by question, superforecasters (Pearson, n = 39)</w:t>
-            </w:r>
-          </w:p>
-        </w:tc>
-        <w:tc>
-          <w:tcPr>
-            <w:tcW w:type="dxa" w:w="3168"/>
-          </w:tcPr>
-          <w:p>
-            <w:pPr>
-              <w:keepNext/>
-              <w:spacing w:after="0" w:before="0"/>
-            </w:pPr>
-            <w:r>
-              <w:t>0.27 [−0.10, 0.52]</w:t>
-            </w:r>
-          </w:p>
-        </w:tc>
-      </w:tr>
-      <w:tr>
-        <w:trPr>
-          <w:cantSplit/>
-        </w:trPr>
-        <w:tc>
-          <w:tcPr>
-            <w:tcW w:type="dxa" w:w="1296"/>
+            <w:tcW w:type="dxa" w:w="1800"/>
           </w:tcPr>
           <w:p>
             <w:pPr>
@@ -1780,7 +1730,58 @@
         </w:tc>
         <w:tc>
           <w:tcPr>
-            <w:tcW w:type="dxa" w:w="4896"/>
+            <w:tcW w:type="dxa" w:w="5256"/>
+          </w:tcPr>
+          <w:p>
+            <w:pPr>
+              <w:keepNext w:val="0"/>
+              <w:spacing w:after="0" w:before="0"/>
+            </w:pPr>
+            <w:r>
+              <w:t>split-half r by question, superforecasters (Pearson, n = 39)</w:t>
+            </w:r>
+          </w:p>
+        </w:tc>
+        <w:tc>
+          <w:tcPr>
+            <w:tcW w:type="dxa" w:w="2304"/>
+          </w:tcPr>
+          <w:p>
+            <w:pPr>
+              <w:keepNext w:val="0"/>
+              <w:spacing w:after="0" w:before="0"/>
+            </w:pPr>
+            <w:r>
+              <w:t>0.27 [−0.10, 0.52]</w:t>
+            </w:r>
+          </w:p>
+        </w:tc>
+      </w:tr>
+      <w:tr>
+        <w:trPr>
+          <w:cantSplit/>
+        </w:trPr>
+        <w:tc>
+          <w:tcPr>
+            <w:tcW w:type="dxa" w:w="1800"/>
+          </w:tcPr>
+          <w:p>
+            <w:pPr>
+              <w:keepNext w:val="0"/>
+              <w:spacing w:after="0" w:before="0"/>
+            </w:pPr>
+            <w:r/>
+            <w:r>
+              <w:rPr>
+                <w:sz w:val="19"/>
+              </w:rPr>
+              <w:t>H5</w:t>
+            </w:r>
+          </w:p>
+        </w:tc>
+        <w:tc>
+          <w:tcPr>
+            <w:tcW w:type="dxa" w:w="5256"/>
           </w:tcPr>
           <w:p>
             <w:pPr>
@@ -1794,7 +1795,7 @@
         </w:tc>
         <w:tc>
           <w:tcPr>
-            <w:tcW w:type="dxa" w:w="3168"/>
+            <w:tcW w:type="dxa" w:w="2304"/>
           </w:tcPr>
           <w:p>
             <w:pPr>
@@ -1807,6 +1808,214 @@
           </w:p>
         </w:tc>
       </w:tr>
+      <w:tr>
+        <w:trPr>
+          <w:cantSplit/>
+        </w:trPr>
+        <w:tc>
+          <w:tcPr>
+            <w:tcW w:type="dxa" w:w="1800"/>
+          </w:tcPr>
+          <w:p>
+            <w:pPr>
+              <w:keepNext w:val="0"/>
+              <w:spacing w:after="0" w:before="0"/>
+            </w:pPr>
+            <w:r>
+              <w:t>H5 (1,000 splits)</w:t>
+            </w:r>
+            <w:r>
+              <w:rPr>
+                <w:sz w:val="19"/>
+              </w:rPr>
+            </w:r>
+          </w:p>
+        </w:tc>
+        <w:tc>
+          <w:tcPr>
+            <w:tcW w:type="dxa" w:w="5256"/>
+          </w:tcPr>
+          <w:p>
+            <w:pPr>
+              <w:keepNext w:val="0"/>
+              <w:spacing w:after="0" w:before="0"/>
+            </w:pPr>
+            <w:r>
+              <w:t>split-half r by question across 1,000 random splits, superforecasters (median; 2.5th to 97.5th percentile of splits)</w:t>
+            </w:r>
+          </w:p>
+        </w:tc>
+        <w:tc>
+          <w:tcPr>
+            <w:tcW w:type="dxa" w:w="2304"/>
+          </w:tcPr>
+          <w:p>
+            <w:pPr>
+              <w:keepNext w:val="0"/>
+              <w:spacing w:after="0" w:before="0"/>
+            </w:pPr>
+            <w:r>
+              <w:t>0.38 [−0.45, 0.78]</w:t>
+            </w:r>
+          </w:p>
+        </w:tc>
+      </w:tr>
+      <w:tr>
+        <w:trPr>
+          <w:cantSplit/>
+        </w:trPr>
+        <w:tc>
+          <w:tcPr>
+            <w:tcW w:type="dxa" w:w="1800"/>
+          </w:tcPr>
+          <w:p>
+            <w:pPr>
+              <w:keepNext w:val="0"/>
+              <w:spacing w:after="0" w:before="0"/>
+            </w:pPr>
+            <w:r>
+              <w:t>H5 (1,000 splits)</w:t>
+            </w:r>
+            <w:r>
+              <w:rPr>
+                <w:sz w:val="19"/>
+              </w:rPr>
+            </w:r>
+          </w:p>
+        </w:tc>
+        <w:tc>
+          <w:tcPr>
+            <w:tcW w:type="dxa" w:w="5256"/>
+          </w:tcPr>
+          <w:p>
+            <w:pPr>
+              <w:keepNext w:val="0"/>
+              <w:spacing w:after="0" w:before="0"/>
+            </w:pPr>
+            <w:r>
+              <w:t>split-half r by question across 1,000 random splits, public (median; 2.5th to 97.5th percentile of splits)</w:t>
+            </w:r>
+          </w:p>
+        </w:tc>
+        <w:tc>
+          <w:tcPr>
+            <w:tcW w:type="dxa" w:w="2304"/>
+          </w:tcPr>
+          <w:p>
+            <w:pPr>
+              <w:keepNext w:val="0"/>
+              <w:spacing w:after="0" w:before="0"/>
+            </w:pPr>
+            <w:r>
+              <w:t>0.23 [0.16, 0.29]</w:t>
+            </w:r>
+          </w:p>
+        </w:tc>
+      </w:tr>
+      <w:tr>
+        <w:trPr>
+          <w:cantSplit/>
+        </w:trPr>
+        <w:tc>
+          <w:tcPr>
+            <w:tcW w:type="dxa" w:w="1800"/>
+          </w:tcPr>
+          <w:p>
+            <w:pPr>
+              <w:keepNext w:val="0"/>
+              <w:spacing w:after="0" w:before="0"/>
+            </w:pPr>
+            <w:r>
+              <w:t>H5 (as locked)</w:t>
+            </w:r>
+            <w:r>
+              <w:rPr>
+                <w:sz w:val="19"/>
+              </w:rPr>
+            </w:r>
+          </w:p>
+        </w:tc>
+        <w:tc>
+          <w:tcPr>
+            <w:tcW w:type="dxa" w:w="5256"/>
+          </w:tcPr>
+          <w:p>
+            <w:pPr>
+              <w:keepNext w:val="0"/>
+              <w:spacing w:after="0" w:before="0"/>
+            </w:pPr>
+            <w:r>
+              <w:t>split-half r by target, superforecasters (Pearson, n = 40); inflated by shared outcomes across horizons</w:t>
+            </w:r>
+          </w:p>
+        </w:tc>
+        <w:tc>
+          <w:tcPr>
+            <w:tcW w:type="dxa" w:w="2304"/>
+          </w:tcPr>
+          <w:p>
+            <w:pPr>
+              <w:keepNext w:val="0"/>
+              <w:spacing w:after="0" w:before="0"/>
+            </w:pPr>
+            <w:r>
+              <w:t>0.78 [0.61, 0.90]</w:t>
+            </w:r>
+          </w:p>
+        </w:tc>
+      </w:tr>
+      <w:tr>
+        <w:trPr>
+          <w:cantSplit/>
+        </w:trPr>
+        <w:tc>
+          <w:tcPr>
+            <w:tcW w:type="dxa" w:w="1800"/>
+          </w:tcPr>
+          <w:p>
+            <w:pPr>
+              <w:keepNext w:val="0"/>
+              <w:spacing w:after="0" w:before="0"/>
+            </w:pPr>
+            <w:r>
+              <w:t>H5 (as locked)</w:t>
+            </w:r>
+            <w:r>
+              <w:rPr>
+                <w:sz w:val="19"/>
+              </w:rPr>
+            </w:r>
+          </w:p>
+        </w:tc>
+        <w:tc>
+          <w:tcPr>
+            <w:tcW w:type="dxa" w:w="5256"/>
+          </w:tcPr>
+          <w:p>
+            <w:pPr>
+              <w:keepNext w:val="0"/>
+              <w:spacing w:after="0" w:before="0"/>
+            </w:pPr>
+            <w:r>
+              <w:t>split-half r by target, public (Pearson, n = 500); inflated by shared outcomes across horizons</w:t>
+            </w:r>
+          </w:p>
+        </w:tc>
+        <w:tc>
+          <w:tcPr>
+            <w:tcW w:type="dxa" w:w="2304"/>
+          </w:tcPr>
+          <w:p>
+            <w:pPr>
+              <w:keepNext w:val="0"/>
+              <w:spacing w:after="0" w:before="0"/>
+            </w:pPr>
+            <w:r>
+              <w:t>0.64 [0.59, 0.69]</w:t>
+            </w:r>
+          </w:p>
+        </w:tc>
+      </w:tr>
     </w:tbl>
     <w:p>
       <w:pPr>
@@ -1843,7 +2052,7 @@
           <w:b w:val="0"/>
           <w:i w:val="0"/>
         </w:rPr>
-        <w:t>The coefficient is 1.79 (95% CI 1.04 to 2.53) for the superforecaster median and 0.97 (0.24 to 1.70) for the public median. Both intervals lie above zero. The public result is the one to lean on. Public forecasters did not deliberate. They still had web access the model did not, so the comparison is not perfectly clean, but it is the closer approximation to a crowd of independent individual judgments against a model's. The superforecaster coefficient mixes individual judgment with the group stage.</w:t>
+        <w:t>The coefficient is 1.79 (95% CI 1.04 to 2.53) for the superforecaster median and 0.97 (0.24 to 1.70) for the public median. Both intervals lie above zero. I give more weight to the public result. Public forecasters did not deliberate. They still had web access the model did not, so the comparison is not perfectly clean, but it is the closer approximation to a crowd of independent individual judgments against a model's. The superforecaster coefficient mixes individual judgment with the group stage.</w:t>
       </w:r>
     </w:p>
     <w:p>
@@ -1879,7 +2088,7 @@
           <w:b w:val="0"/>
           <w:i w:val="0"/>
         </w:rPr>
-        <w:t>This is the point at which the forecasting domain parts from chess. In chess, the human deviation carried nothing the engine lacked: the opponent's error beyond difficulty did not rise with the deviation's character, and the deviation cost on average. Here a public forecaster who lost to the model on average still contributed, in aggregate, something the model did not have. Losing on average and carrying information are compatible. The public forecasts are noisier than the model's and the noise costs Brier points, but the signal inside them is not already in the model. Section 6 asks the harder question of whether that signal is already in the other models.</w:t>
+        <w:t>Here the forecasting result differs from the chess result. In chess, the human deviation carried nothing the engine lacked: the opponent's error beyond difficulty did not rise with the deviation's character, and the deviation cost on average. Here a public forecaster who lost to the model on average still contributed, in aggregate, something the model did not have. Losing on average and carrying information are compatible. The public forecasts are noisier than the model's and the noise costs Brier points, but the signal inside them is not already in the model. Section 6 asks the harder question of whether that signal is already in the other models.</w:t>
       </w:r>
     </w:p>
     <w:p>
@@ -1912,7 +2121,7 @@
           <w:b w:val="0"/>
           <w:i w:val="0"/>
         </w:rPr>
-        <w:t>With benchmark (b), the median of 34 models, the coefficient is 0.036 (0.021 to 0.052). This is a robustness item, not a second primary result, and it is reported as what it is: a result that depends on which benchmark is used. Against a single strong model the return is flat in disagreement; against the crowd of models it rises. One reading is that the median of 34 models is itself worse where the models disagree, so a human forecast has more to beat there, while the best single model is not hurt by the others' disagreement in the same way. I do not test that reading.</w:t>
+        <w:t>With benchmark (b), the median of 34 models, the coefficient is 0.036 (0.021 to 0.052). This is a robustness item, not a second primary result. It shows that the H3 result depends on which benchmark is used. Against a single strong model the return is flat in disagreement; against the crowd of models it rises. One reading is that the median of 34 models is itself worse where the models disagree, so a human forecast has more to beat there, while the best single model is not hurt by the others' disagreement in the same way. I do not test that reading.</w:t>
       </w:r>
     </w:p>
     <w:p>
@@ -1993,7 +2202,7 @@
           <w:b w:val="0"/>
           <w:i w:val="0"/>
         </w:rPr>
-        <w:t>The locked interaction EXT_a × DIS is −0.021 (−0.024 to −0.018) on all rows, +0.016 (0.014 to 0.019) on non-crossing rows, and +0.016 in the pilot. Three fits, three intervals excluding zero, two signs. The crossing rows carry the negative sign in the primary fit. I do not interpret this coefficient. It is disclosed as a pre-registered quantity that reversed between a 30% subsample and the full sample, which is a fact about how thinly a question-level interaction is identified on 162 clusters.</w:t>
+        <w:t>The locked interaction EXT_a × DIS is −0.021 (−0.024 to −0.018) on all rows, +0.016 (0.014 to 0.019) on non-crossing rows, and +0.016 in the pilot. All three intervals exclude zero, and the sign is not the same in all three. The crossing rows carry the negative sign in the primary fit. I do not interpret this coefficient. It is disclosed as a pre-registered quantity that reversed between a 30% subsample and the full sample, which is a fact about how thinly a question-level interaction is identified on 162 clusters.</w:t>
       </w:r>
     </w:p>
     <w:p>
@@ -2014,7 +2223,7 @@
           <w:b w:val="0"/>
           <w:i w:val="0"/>
         </w:rPr>
-        <w:t>For each row I subtract from G_a the mean of G_a across all other forecasters on that target, leaving the forecaster's own row out. This removes the target's difficulty, which would otherwise leak into a forecaster's average through the non-random set of targets they chose to answer. The 162 questions were then split in half by one random assignment (seed 20260906), with every target of a question in the same half and the same split for every forecaster, and each forecaster's mean demeaned gain was computed in each half. The split is by question rather than by target because targets of one question at different horizons often share an outcome and the same judgment; a split by target would place that judgment in both halves and inflate the correlation. The specification as locked split by target. The change is Amendment 4, recorded in Section 9, and the target-level result is reported there.</w:t>
+        <w:t>For each row I subtract from G_a the mean of G_a across all other forecasters on that target, leaving the forecaster's own row out. This removes the target's difficulty, which would otherwise leak into a forecaster's average through the non-random set of targets they chose to answer. The 162 questions were then split in half by one random assignment (seed 20260906), with every target of a question in the same half and the same split for every forecaster, and each forecaster's mean demeaned gain was computed in each half. The split is by question rather than by target because targets of one question at different horizons often share an outcome and the same judgment; a split by target would place that judgment in both halves and inflate the correlation. The specification as locked split by target. The change is Amendment 4, recorded in Section 9. The target-level result is reported there and in Table 2.</w:t>
       </w:r>
     </w:p>
     <w:p>
@@ -2090,7 +2299,7 @@
           <w:b w:val="0"/>
           <w:i w:val="0"/>
         </w:rPr>
-        <w:t>The forecaster random intercept in the H3 model accounts for 4.1% of the variance of G_a; question and target together account for 28%, and the residual for 68%. A small variance share and a low split-half correlation are consistent. Most of the variation in gain is about the target, and one round of about 80 questions per half does not average that away.</w:t>
+        <w:t>The forecaster random intercept in the H3 model accounts for 4.1% of the variance of G_a; question and target together account for 28%, and the residual for 68%. A small variance share and a low split-half correlation are consistent. Most of the variation in gain is about the target, and 81 questions per half are not enough to average it out.</w:t>
       </w:r>
     </w:p>
     <w:p>
@@ -2557,7 +2766,7 @@
           <w:b w:val="0"/>
           <w:i w:val="0"/>
         </w:rPr>
-        <w:t>The two domains differ on one thing. In chess the human and the engine saw the same board. In forecasting the humans could look up news the model did not have. So the difference is consistent with the benchmark's fallibility deciding it, and equally with a difference in information access, and this design cannot separate the two. In chess the human deviation carried no information the engine lacked. In forecasting it did, relative to the single best model, for both groups, including the group that lost to the model on average. Section 6 narrows that: relative to an ensemble of the other models, only the superforecasters add something on a scale-free measure. The forecasting result that survives is relative to a single model; the chess study had no ensemble counterpart, so the two-case comparison is between single benchmarks. Whether the human has anything to add is consistent with being set by whether the benchmark can err. Where it adds, and in which direction, is not settled by that, and the forecasting results give no simple answer to either. The two domains differ in more than the benchmark's fallibility, including what information each side had, so this is a pattern across two cases, not a test of what produces it.</w:t>
+        <w:t>The two domains differ on one thing. In chess the human and the engine saw the same board. In forecasting the humans could look up news the model did not have. So the difference is consistent with the benchmark's fallibility deciding it, and equally with a difference in information access, and this design cannot separate the two. In chess the human deviation carried no information the engine lacked. In forecasting it did, relative to the single best model, for both groups, including the group that lost to the model on average. Section 6 narrows that: relative to an ensemble of the other models, only the superforecasters add something on a scale-free measure. The forecasting result that survives is relative to a single model; the chess study had no ensemble counterpart, so the two-case comparison is between single benchmarks. Whether the human has anything to add is consistent with being set by the benchmark's fallibility or by the information gap. Where it adds, and in which direction, is not settled by that, and the forecasting results give no simple answer to either. The two domains differ in more than the benchmark's fallibility, including what information each side had, so this is a pattern across two cases, not a test of what produces it.</w:t>
       </w:r>
     </w:p>
     <w:p>
@@ -3486,7 +3695,7 @@
           <w:b w:val="0"/>
           <w:i w:val="0"/>
         </w:rPr>
-        <w:t>Benchmark dependence. The H3 disagreement result changes sign when the single best model is swapped for the median of 34. A result that moves with the benchmark is a result about the benchmark as much as about the forecasters. I chose the single model as primary before seeing any data because it mirrors the chess design, and I report the other because the specification required it.</w:t>
+        <w:t>Benchmark dependence. The H3 disagreement result changes sign when the single best model is swapped for the median of 34. Such a result tells as much about the benchmark as about the forecasters. I chose the single model as primary before seeing any data because it mirrors the chess design, and I report the other because the specification required it.</w:t>
       </w:r>
     </w:p>
     <w:p>
@@ -3627,7 +3836,7 @@
           <w:b w:val="0"/>
           <w:i w:val="0"/>
         </w:rPr>
-        <w:t>All mixed models converged. Every fit printed the statsmodels warning that the maximum-likelihood estimate may be on the boundary of the parameter space, For the second review every reported mixed model was refitted (159 fits, each reproducing its published fixed effects) and the variance components read off. Under a rule of a variance below 1e-6 or below 0.1% of the residual variance, no forecaster, question, or target component is at the boundary in any fit; the smallest is a forecaster variance at 0.9% of the residual. The warning does not correspond to a component estimated at zero. The per-fit values are in the repository (docs/boundary_components.csv). The coefficient estimates and their intervals are reported as fitted. R and lme4 were not installed; the mixed models were fitted in statsmodels 0.14.6. The pilot was refitted after the full run with the final model code to confirm that its numbers were unchanged (1,741 numeric tokens identical).</w:t>
+        <w:t>All mixed models converged. Every fit printed the statsmodels warning that the maximum-likelihood estimate may be on the boundary of the parameter space. To check this, every reported mixed model was refitted (159 fits, each reproducing its published fixed effects) and the variance components read off. Under a rule of a variance below 10⁻⁶ or below 0.1% of the residual variance, no forecaster, question, or target component is at the boundary in any fit; the smallest is a forecaster variance at 0.9% of the residual. The warning does not correspond to a component estimated at zero. The per-fit values are in the repository (docs/boundary_components.csv). The coefficient estimates and their intervals are reported as fitted. The mixed models were fitted in statsmodels 0.14.6; R and lme4 were not used. The pilot was refitted after the full run with the final model code to confirm that its numbers were unchanged (1,741 numeric tokens identical).</w:t>
       </w:r>
     </w:p>
     <w:p>
@@ -3651,7 +3860,7 @@
           <w:b w:val="0"/>
           <w:i w:val="0"/>
         </w:rPr>
-        <w:t>The chess study to which this one is compared was published with the same discipline: a locked specification, disclosed faults, and a public repository. Both repositories carry the specification with all amendments in place, the code, and the reports the numbers in this paper are drawn from.</w:t>
+        <w:t>The chess study to which this one is compared was published in the same way: a locked specification, disclosed faults, and a public repository. Both repositories carry the specification with all amendments in place, the code, and the reports the numbers in this paper are drawn from.</w:t>
       </w:r>
     </w:p>
     <w:p>
@@ -3714,7 +3923,7 @@
           <w:b w:val="0"/>
           <w:i w:val="0"/>
         </w:rPr>
-        <w:t>The author designed the study, wrote and locked both specifications, verified the results, and wrote the manuscript. The author declares no conflicts of interest and received no funding for this work.</w:t>
+        <w:t>The author designed the study, wrote and locked both specifications, verified the results, and wrote the manuscript. The author thanks the ForecastBench team for publishing the individual-level forecasts this study depends on. The author declares no conflicts of interest and received no funding for this work.</w:t>
       </w:r>
     </w:p>
     <w:p>

</xml_diff>